<commit_message>
Add business-scenario tests (macro views): rates, war, taxes
39 tests (tests/test_business_scenarios.py) covering what happens to the output
when a client voices a macro view — a rate hike/cut, a war (or its end) asking
for alternatives, a tax rise/cut — delivered as either a tactical instruction or
a document. Each pins the product contract:
  1. the scenario reaches the AI verbatim (it's in the prompt),
  2. it SHAPES the advisory commentary (the write-up reflects it),
  3. it does NOT move the computed figures — FACTS identical with/without it
     (a macro opinion never invents or alters a number),
  4. the interest-rate tool reports bond exposure but refuses to fabricate an
     unsourced +100bp impact.

Report generator picks up the new file; summary-card counts are now computed
dynamically (added a Business layer). Suite: 69 -> 108 tests; reports regenerated.

Co-Authored-By: Claude Opus 4.8 <noreply@anthropic.com>
</commit_message>
<xml_diff>
--- a/Meridian_Copilot_Test_Report_v10.docx
+++ b/Meridian_Copilot_Test_Report_v10.docx
@@ -56,7 +56,7 @@
           <w:color w:val="2E7D52"/>
           <w:sz w:val="24"/>
         </w:rPr>
-        <w:t>69/69 tests passed  ·  15 July 2026</w:t>
+        <w:t>108/108 tests passed  ·  16 July 2026</w:t>
       </w:r>
     </w:p>
     <w:p>
@@ -327,6 +327,57 @@
                 <w:sz w:val="20"/>
               </w:rPr>
               <w:t>16</w:t>
+            </w:r>
+          </w:p>
+        </w:tc>
+      </w:tr>
+      <w:tr>
+        <w:tc>
+          <w:tcPr>
+            <w:tcW w:type="dxa" w:w="2880"/>
+          </w:tcPr>
+          <w:p>
+            <w:r>
+              <w:rPr>
+                <w:rFonts w:ascii="Calibri" w:hAnsi="Calibri"/>
+                <w:b/>
+                <w:color w:val="1E2A56"/>
+                <w:sz w:val="20"/>
+              </w:rPr>
+              <w:t>Business</w:t>
+            </w:r>
+          </w:p>
+        </w:tc>
+        <w:tc>
+          <w:tcPr>
+            <w:tcW w:type="dxa" w:w="2880"/>
+          </w:tcPr>
+          <w:p>
+            <w:r>
+              <w:rPr>
+                <w:rFonts w:ascii="Calibri" w:hAnsi="Calibri"/>
+                <w:sz w:val="20"/>
+              </w:rPr>
+              <w:t>Client macro views (rates, war, tax) shape prose, not the numbers</w:t>
+            </w:r>
+          </w:p>
+        </w:tc>
+        <w:tc>
+          <w:tcPr>
+            <w:tcW w:type="dxa" w:w="2880"/>
+          </w:tcPr>
+          <w:p>
+            <w:pPr>
+              <w:jc w:val="center"/>
+            </w:pPr>
+            <w:r>
+              <w:rPr>
+                <w:rFonts w:ascii="Calibri" w:hAnsi="Calibri"/>
+                <w:b/>
+                <w:color w:val="2E7D52"/>
+                <w:sz w:val="20"/>
+              </w:rPr>
+              <w:t>39</w:t>
             </w:r>
           </w:p>
         </w:tc>
@@ -4601,6 +4652,449 @@
           <w:color w:val="1E2A56"/>
           <w:sz w:val="30"/>
         </w:rPr>
+        <w:t>Business scenarios  ·  39 tests</w:t>
+      </w:r>
+    </w:p>
+    <w:p>
+      <w:r>
+        <w:rPr>
+          <w:rFonts w:ascii="Calibri" w:hAnsi="Calibri"/>
+          <w:b/>
+          <w:color w:val="B0872A"/>
+          <w:sz w:val="17"/>
+        </w:rPr>
+        <w:t xml:space="preserve">Business   </w:t>
+      </w:r>
+      <w:r>
+        <w:rPr>
+          <w:rFonts w:ascii="Calibri" w:hAnsi="Calibri"/>
+          <w:b w:val="0"/>
+          <w:i/>
+          <w:color w:val="47517A"/>
+          <w:sz w:val="19"/>
+        </w:rPr>
+        <w:t>What happens to the output on a client macro view — a rate hike/cut, a war (or its end) prompting alternatives, a tax rise/cut: it reaches the AI, shapes the commentary, and never moves the grounded figures.</w:t>
+      </w:r>
+    </w:p>
+    <w:p>
+      <w:r>
+        <w:rPr>
+          <w:rFonts w:ascii="Consolas" w:hAnsi="Consolas"/>
+          <w:b w:val="0"/>
+          <w:color w:val="47517A"/>
+          <w:sz w:val="17"/>
+        </w:rPr>
+        <w:t>file: tests/test_business_scenarios.py</w:t>
+      </w:r>
+    </w:p>
+    <w:tbl>
+      <w:tblPr>
+        <w:tblStyle w:val="TableGrid"/>
+        <w:tblW w:type="auto" w:w="0"/>
+        <w:tblLook w:firstColumn="1" w:firstRow="1" w:lastColumn="0" w:lastRow="0" w:noHBand="0" w:noVBand="1" w:val="04A0"/>
+      </w:tblPr>
+      <w:tblGrid>
+        <w:gridCol w:w="792"/>
+        <w:gridCol w:w="7776"/>
+        <w:gridCol w:w="1152"/>
+      </w:tblGrid>
+      <w:tr>
+        <w:tc>
+          <w:tcPr>
+            <w:tcW w:type="dxa" w:w="2880"/>
+            <w:shd w:fill="1E2A56"/>
+          </w:tcPr>
+          <w:p>
+            <w:r>
+              <w:rPr>
+                <w:rFonts w:ascii="Calibri" w:hAnsi="Calibri"/>
+                <w:b/>
+                <w:color w:val="FFFFFF"/>
+                <w:sz w:val="18"/>
+              </w:rPr>
+              <w:t>#</w:t>
+            </w:r>
+          </w:p>
+        </w:tc>
+        <w:tc>
+          <w:tcPr>
+            <w:tcW w:type="dxa" w:w="2880"/>
+            <w:shd w:fill="1E2A56"/>
+          </w:tcPr>
+          <w:p>
+            <w:r>
+              <w:rPr>
+                <w:rFonts w:ascii="Calibri" w:hAnsi="Calibri"/>
+                <w:b/>
+                <w:color w:val="FFFFFF"/>
+                <w:sz w:val="18"/>
+              </w:rPr>
+              <w:t>Scenario verified</w:t>
+            </w:r>
+          </w:p>
+        </w:tc>
+        <w:tc>
+          <w:tcPr>
+            <w:tcW w:type="dxa" w:w="2880"/>
+            <w:shd w:fill="1E2A56"/>
+          </w:tcPr>
+          <w:p>
+            <w:r>
+              <w:rPr>
+                <w:rFonts w:ascii="Calibri" w:hAnsi="Calibri"/>
+                <w:b/>
+                <w:color w:val="FFFFFF"/>
+                <w:sz w:val="18"/>
+              </w:rPr>
+              <w:t>Result</w:t>
+            </w:r>
+          </w:p>
+        </w:tc>
+      </w:tr>
+      <w:tr>
+        <w:tc>
+          <w:tcPr>
+            <w:tcW w:type="dxa" w:w="792"/>
+          </w:tcPr>
+          <w:p>
+            <w:pPr>
+              <w:jc w:val="center"/>
+            </w:pPr>
+            <w:r>
+              <w:rPr>
+                <w:rFonts w:ascii="Calibri" w:hAnsi="Calibri"/>
+                <w:b/>
+                <w:color w:val="47517A"/>
+                <w:sz w:val="18"/>
+              </w:rPr>
+              <w:t>1</w:t>
+            </w:r>
+          </w:p>
+        </w:tc>
+        <w:tc>
+          <w:tcPr>
+            <w:tcW w:type="dxa" w:w="7776"/>
+          </w:tcPr>
+          <w:p>
+            <w:r>
+              <w:rPr>
+                <w:rFonts w:ascii="Calibri" w:hAnsi="Calibri"/>
+                <w:sz w:val="19"/>
+              </w:rPr>
+              <w:t>A client macro view (rate/war/tax) reaches the AI verbatim.  (12 variants)</w:t>
+            </w:r>
+          </w:p>
+        </w:tc>
+        <w:tc>
+          <w:tcPr>
+            <w:tcW w:type="dxa" w:w="1152"/>
+            <w:shd w:fill="EAF3EC"/>
+          </w:tcPr>
+          <w:p>
+            <w:pPr>
+              <w:jc w:val="center"/>
+            </w:pPr>
+            <w:r>
+              <w:rPr>
+                <w:rFonts w:ascii="Calibri" w:hAnsi="Calibri"/>
+                <w:b/>
+                <w:color w:val="2E7D52"/>
+                <w:sz w:val="18"/>
+              </w:rPr>
+              <w:t>PASS</w:t>
+            </w:r>
+          </w:p>
+        </w:tc>
+      </w:tr>
+      <w:tr>
+        <w:tc>
+          <w:tcPr>
+            <w:tcW w:type="dxa" w:w="792"/>
+          </w:tcPr>
+          <w:p>
+            <w:pPr>
+              <w:jc w:val="center"/>
+            </w:pPr>
+            <w:r>
+              <w:rPr>
+                <w:rFonts w:ascii="Calibri" w:hAnsi="Calibri"/>
+                <w:b/>
+                <w:color w:val="47517A"/>
+                <w:sz w:val="18"/>
+              </w:rPr>
+              <w:t>2</w:t>
+            </w:r>
+          </w:p>
+        </w:tc>
+        <w:tc>
+          <w:tcPr>
+            <w:tcW w:type="dxa" w:w="7776"/>
+          </w:tcPr>
+          <w:p>
+            <w:r>
+              <w:rPr>
+                <w:rFonts w:ascii="Calibri" w:hAnsi="Calibri"/>
+                <w:sz w:val="19"/>
+              </w:rPr>
+              <w:t>The macro view shapes the advisory commentary.  (12 variants)</w:t>
+            </w:r>
+          </w:p>
+        </w:tc>
+        <w:tc>
+          <w:tcPr>
+            <w:tcW w:type="dxa" w:w="1152"/>
+            <w:shd w:fill="EAF3EC"/>
+          </w:tcPr>
+          <w:p>
+            <w:pPr>
+              <w:jc w:val="center"/>
+            </w:pPr>
+            <w:r>
+              <w:rPr>
+                <w:rFonts w:ascii="Calibri" w:hAnsi="Calibri"/>
+                <w:b/>
+                <w:color w:val="2E7D52"/>
+                <w:sz w:val="18"/>
+              </w:rPr>
+              <w:t>PASS</w:t>
+            </w:r>
+          </w:p>
+        </w:tc>
+      </w:tr>
+      <w:tr>
+        <w:tc>
+          <w:tcPr>
+            <w:tcW w:type="dxa" w:w="792"/>
+          </w:tcPr>
+          <w:p>
+            <w:pPr>
+              <w:jc w:val="center"/>
+            </w:pPr>
+            <w:r>
+              <w:rPr>
+                <w:rFonts w:ascii="Calibri" w:hAnsi="Calibri"/>
+                <w:b/>
+                <w:color w:val="47517A"/>
+                <w:sz w:val="18"/>
+              </w:rPr>
+              <w:t>3</w:t>
+            </w:r>
+          </w:p>
+        </w:tc>
+        <w:tc>
+          <w:tcPr>
+            <w:tcW w:type="dxa" w:w="7776"/>
+          </w:tcPr>
+          <w:p>
+            <w:r>
+              <w:rPr>
+                <w:rFonts w:ascii="Calibri" w:hAnsi="Calibri"/>
+                <w:sz w:val="19"/>
+              </w:rPr>
+              <w:t>A macro opinion shapes prose, never figures: the FACTS block (every number the deck shows) is byte-for-byte identical with and without the scenario.  (12 variants)</w:t>
+            </w:r>
+          </w:p>
+        </w:tc>
+        <w:tc>
+          <w:tcPr>
+            <w:tcW w:type="dxa" w:w="1152"/>
+            <w:shd w:fill="EAF3EC"/>
+          </w:tcPr>
+          <w:p>
+            <w:pPr>
+              <w:jc w:val="center"/>
+            </w:pPr>
+            <w:r>
+              <w:rPr>
+                <w:rFonts w:ascii="Calibri" w:hAnsi="Calibri"/>
+                <w:b/>
+                <w:color w:val="2E7D52"/>
+                <w:sz w:val="18"/>
+              </w:rPr>
+              <w:t>PASS</w:t>
+            </w:r>
+          </w:p>
+        </w:tc>
+      </w:tr>
+      <w:tr>
+        <w:tc>
+          <w:tcPr>
+            <w:tcW w:type="dxa" w:w="792"/>
+          </w:tcPr>
+          <w:p>
+            <w:pPr>
+              <w:jc w:val="center"/>
+            </w:pPr>
+            <w:r>
+              <w:rPr>
+                <w:rFonts w:ascii="Calibri" w:hAnsi="Calibri"/>
+                <w:b/>
+                <w:color w:val="47517A"/>
+                <w:sz w:val="18"/>
+              </w:rPr>
+              <w:t>4</w:t>
+            </w:r>
+          </w:p>
+        </w:tc>
+        <w:tc>
+          <w:tcPr>
+            <w:tcW w:type="dxa" w:w="7776"/>
+          </w:tcPr>
+          <w:p>
+            <w:r>
+              <w:rPr>
+                <w:rFonts w:ascii="Calibri" w:hAnsi="Calibri"/>
+                <w:sz w:val="19"/>
+              </w:rPr>
+              <w:t>'What if rates are hiked?' → the deterministic tool states the fixed-income exposure but refuses to estimate a +100bp impact it cannot source.</w:t>
+            </w:r>
+          </w:p>
+        </w:tc>
+        <w:tc>
+          <w:tcPr>
+            <w:tcW w:type="dxa" w:w="1152"/>
+            <w:shd w:fill="EAF3EC"/>
+          </w:tcPr>
+          <w:p>
+            <w:pPr>
+              <w:jc w:val="center"/>
+            </w:pPr>
+            <w:r>
+              <w:rPr>
+                <w:rFonts w:ascii="Calibri" w:hAnsi="Calibri"/>
+                <w:b/>
+                <w:color w:val="2E7D52"/>
+                <w:sz w:val="18"/>
+              </w:rPr>
+              <w:t>PASS</w:t>
+            </w:r>
+          </w:p>
+        </w:tc>
+      </w:tr>
+      <w:tr>
+        <w:tc>
+          <w:tcPr>
+            <w:tcW w:type="dxa" w:w="792"/>
+          </w:tcPr>
+          <w:p>
+            <w:pPr>
+              <w:jc w:val="center"/>
+            </w:pPr>
+            <w:r>
+              <w:rPr>
+                <w:rFonts w:ascii="Calibri" w:hAnsi="Calibri"/>
+                <w:b/>
+                <w:color w:val="47517A"/>
+                <w:sz w:val="18"/>
+              </w:rPr>
+              <w:t>5</w:t>
+            </w:r>
+          </w:p>
+        </w:tc>
+        <w:tc>
+          <w:tcPr>
+            <w:tcW w:type="dxa" w:w="7776"/>
+          </w:tcPr>
+          <w:p>
+            <w:r>
+              <w:rPr>
+                <w:rFonts w:ascii="Calibri" w:hAnsi="Calibri"/>
+                <w:sz w:val="19"/>
+              </w:rPr>
+              <w:t>A rate-move question routes to the rate tool.</w:t>
+            </w:r>
+          </w:p>
+        </w:tc>
+        <w:tc>
+          <w:tcPr>
+            <w:tcW w:type="dxa" w:w="1152"/>
+            <w:shd w:fill="EAF3EC"/>
+          </w:tcPr>
+          <w:p>
+            <w:pPr>
+              <w:jc w:val="center"/>
+            </w:pPr>
+            <w:r>
+              <w:rPr>
+                <w:rFonts w:ascii="Calibri" w:hAnsi="Calibri"/>
+                <w:b/>
+                <w:color w:val="2E7D52"/>
+                <w:sz w:val="18"/>
+              </w:rPr>
+              <w:t>PASS</w:t>
+            </w:r>
+          </w:p>
+        </w:tc>
+      </w:tr>
+      <w:tr>
+        <w:tc>
+          <w:tcPr>
+            <w:tcW w:type="dxa" w:w="792"/>
+          </w:tcPr>
+          <w:p>
+            <w:pPr>
+              <w:jc w:val="center"/>
+            </w:pPr>
+            <w:r>
+              <w:rPr>
+                <w:rFonts w:ascii="Calibri" w:hAnsi="Calibri"/>
+                <w:b/>
+                <w:color w:val="47517A"/>
+                <w:sz w:val="18"/>
+              </w:rPr>
+              <w:t>6</w:t>
+            </w:r>
+          </w:p>
+        </w:tc>
+        <w:tc>
+          <w:tcPr>
+            <w:tcW w:type="dxa" w:w="7776"/>
+          </w:tcPr>
+          <w:p>
+            <w:r>
+              <w:rPr>
+                <w:rFonts w:ascii="Calibri" w:hAnsi="Calibri"/>
+                <w:sz w:val="19"/>
+              </w:rPr>
+              <w:t>The scenario moves the deck's prose, not its tables.</w:t>
+            </w:r>
+          </w:p>
+        </w:tc>
+        <w:tc>
+          <w:tcPr>
+            <w:tcW w:type="dxa" w:w="1152"/>
+            <w:shd w:fill="EAF3EC"/>
+          </w:tcPr>
+          <w:p>
+            <w:pPr>
+              <w:jc w:val="center"/>
+            </w:pPr>
+            <w:r>
+              <w:rPr>
+                <w:rFonts w:ascii="Calibri" w:hAnsi="Calibri"/>
+                <w:b/>
+                <w:color w:val="2E7D52"/>
+                <w:sz w:val="18"/>
+              </w:rPr>
+              <w:t>PASS</w:t>
+            </w:r>
+          </w:p>
+        </w:tc>
+      </w:tr>
+    </w:tbl>
+    <w:p>
+      <w:pPr>
+        <w:pBdr>
+          <w:bottom w:val="single" w:sz="6" w:space="2" w:color="B0872A"/>
+        </w:pBdr>
+      </w:pPr>
+      <w:r>
+        <w:rPr>
+          <w:rFonts w:ascii="Calibri" w:hAnsi="Calibri"/>
+          <w:b/>
+          <w:color w:val="1E2A56"/>
+          <w:sz w:val="30"/>
+        </w:rPr>
         <w:t>How to run</w:t>
       </w:r>
     </w:p>

</xml_diff>